<commit_message>
Checkpoint: flatten Phase 3 capstone folders to root, add per-day analysis notes
Moves Day27-30 capstone projects out of the "Phase 3" subdirectory so every
tutorial day lives at the repo root with a consistent layout, and adds a
missing.md per day capturing gaps found in an initial pass (missing error
handling, retries, logging, etc.) to work from during cleanup.
</commit_message>
<xml_diff>
--- a/Day1-Conversationalist.docx
+++ b/Day1-Conversationalist.docx
@@ -10,14 +10,7 @@
         <w:t>Day 1: The Conversationalist (Building a Chatbot)</w:t>
       </w:r>
     </w:p>
-    <w:p>
-      <w:pPr>
-        <w:rPr>
-          <w:rFonts w:ascii="Calibri" w:hAnsi="Calibri"/>
-          <w:sz w:val="22"/>
-        </w:rPr>
-      </w:pPr>
-    </w:p>
+    <w:p/>
     <w:p>
       <w:pPr>
         <w:pStyle w:val="Heading2"/>
@@ -27,28 +20,11 @@
       </w:r>
     </w:p>
     <w:p>
-      <w:pPr>
-        <w:rPr>
-          <w:rFonts w:ascii="Calibri" w:hAnsi="Calibri"/>
-          <w:sz w:val="22"/>
-        </w:rPr>
-      </w:pPr>
-      <w:r>
-        <w:rPr>
-          <w:rFonts w:ascii="Calibri" w:hAnsi="Calibri"/>
-          <w:sz w:val="22"/>
-        </w:rPr>
-        <w:t>In this foundational project, we are building a continuous, terminal-based chatbot. The goal is to introduce the absolute core mechanics of Microsoft's Semantic Kernel: setting up the Kernel, connecting an AI model (Google Gemini), and managing a multi-turn conversation using a chat history object.</w:t>
-      </w:r>
-    </w:p>
-    <w:p>
-      <w:pPr>
-        <w:rPr>
-          <w:rFonts w:ascii="Calibri" w:hAnsi="Calibri"/>
-          <w:sz w:val="22"/>
-        </w:rPr>
-      </w:pPr>
-    </w:p>
+      <w:r>
+        <w:t>In this foundational project, we build a continuous, terminal-based chatbot. Running the program starts an infinite loop that reads a line of text from the console, sends it to Google's Gemini model through Semantic Kernel, prints the reply, and waits for the next line — until the user types "exit". The goal is to introduce the absolute core mechanics of Microsoft's Semantic Kernel: setting up the `Kernel`, connecting an AI model (Google Gemini), and managing a multi-turn conversation using a `ChatHistory` object so the model has memory of what was already said.</w:t>
+      </w:r>
+    </w:p>
+    <w:p/>
     <w:p>
       <w:pPr>
         <w:pStyle w:val="Heading2"/>
@@ -62,27 +38,12 @@
         <w:pStyle w:val="ListParagraph"/>
         <w:numPr>
           <w:ilvl w:val="0"/>
-          <w:numId w:val="1"/>
+          <w:numId w:val="4"/>
         </w:numPr>
-        <w:rPr>
-          <w:rFonts w:ascii="Calibri" w:hAnsi="Calibri"/>
-          <w:sz w:val="22"/>
-        </w:rPr>
-      </w:pPr>
-      <w:r>
-        <w:rPr>
-          <w:rFonts w:ascii="Calibri" w:hAnsi="Calibri"/>
-          <w:b/>
-          <w:sz w:val="22"/>
-        </w:rPr>
-        <w:t>Environment:</w:t>
-      </w:r>
-      <w:r>
-        <w:rPr>
-          <w:rFonts w:ascii="Calibri" w:hAnsi="Calibri"/>
-          <w:sz w:val="22"/>
-        </w:rPr>
-        <w:t xml:space="preserve"> .NET 10 SDK installed.</w:t>
+        <w:ind w:left="1080"/>
+      </w:pPr>
+      <w:r>
+        <w:t>Environment: .NET 10 SDK installed.</w:t>
       </w:r>
     </w:p>
     <w:p>
@@ -90,41 +51,12 @@
         <w:pStyle w:val="ListParagraph"/>
         <w:numPr>
           <w:ilvl w:val="0"/>
-          <w:numId w:val="1"/>
+          <w:numId w:val="4"/>
         </w:numPr>
-        <w:rPr>
-          <w:rFonts w:ascii="Calibri" w:hAnsi="Calibri" w:cs="Calibri"/>
-          <w:sz w:val="22"/>
-        </w:rPr>
-      </w:pPr>
-      <w:r>
-        <w:rPr>
-          <w:rFonts w:ascii="Calibri" w:hAnsi="Calibri" w:cs="Calibri"/>
-          <w:b/>
-          <w:sz w:val="22"/>
-        </w:rPr>
-        <w:t>Project Type:</w:t>
-      </w:r>
-      <w:r>
-        <w:rPr>
-          <w:rFonts w:ascii="Calibri" w:hAnsi="Calibri" w:cs="Calibri"/>
-          <w:sz w:val="22"/>
-        </w:rPr>
-        <w:t xml:space="preserve"> A standard C# Console Application (</w:t>
-      </w:r>
-      <w:r>
-        <w:rPr>
-          <w:rFonts w:ascii="Consolas" w:hAnsi="Consolas" w:cs="Calibri"/>
-          <w:sz w:val="20"/>
-        </w:rPr>
-        <w:t>dotnet new console</w:t>
-      </w:r>
-      <w:r>
-        <w:rPr>
-          <w:rFonts w:ascii="Calibri" w:hAnsi="Calibri" w:cs="Calibri"/>
-          <w:sz w:val="22"/>
-        </w:rPr>
-        <w:t>).</w:t>
+        <w:ind w:left="1080"/>
+      </w:pPr>
+      <w:r>
+        <w:t>Project Type: A standard C# Console Application (`dotnet new console`).</w:t>
       </w:r>
     </w:p>
     <w:p>
@@ -132,71 +64,22 @@
         <w:pStyle w:val="ListParagraph"/>
         <w:numPr>
           <w:ilvl w:val="0"/>
-          <w:numId w:val="1"/>
+          <w:numId w:val="4"/>
         </w:numPr>
-        <w:rPr>
-          <w:rFonts w:ascii="Calibri" w:hAnsi="Calibri" w:cs="Calibri"/>
-          <w:sz w:val="22"/>
-        </w:rPr>
-      </w:pPr>
-      <w:r>
-        <w:rPr>
-          <w:rFonts w:ascii="Calibri" w:hAnsi="Calibri" w:cs="Calibri"/>
-          <w:b/>
-          <w:sz w:val="22"/>
-        </w:rPr>
+        <w:ind w:left="1080"/>
+      </w:pPr>
+      <w:r>
         <w:t>NuGet Packages required:</w:t>
       </w:r>
     </w:p>
     <w:p>
-      <w:pPr>
-        <w:rPr>
-          <w:rFonts w:ascii="Calibri" w:hAnsi="Calibri" w:cs="Calibri"/>
-          <w:sz w:val="22"/>
-        </w:rPr>
-      </w:pPr>
-      <w:r>
-        <w:rPr>
-          <w:rFonts w:ascii="Calibri" w:hAnsi="Calibri" w:cs="Calibri"/>
-          <w:sz w:val="22"/>
-        </w:rPr>
-        <w:t xml:space="preserve">  - </w:t>
-      </w:r>
-      <w:r>
-        <w:rPr>
-          <w:rFonts w:ascii="Consolas" w:hAnsi="Consolas" w:cs="Calibri"/>
-          <w:sz w:val="20"/>
-        </w:rPr>
-        <w:t>Microsoft.SemanticKernel.Core</w:t>
-      </w:r>
-      <w:r>
-        <w:rPr>
-          <w:rFonts w:ascii="Calibri" w:hAnsi="Calibri" w:cs="Calibri"/>
-          <w:sz w:val="22"/>
-        </w:rPr>
-        <w:t xml:space="preserve"> (the core SDK)</w:t>
-      </w:r>
-    </w:p>
-    <w:p>
-      <w:pPr>
-        <w:rPr>
-          <w:rFonts w:ascii="Calibri" w:hAnsi="Calibri" w:cs="Calibri"/>
-          <w:sz w:val="22"/>
-        </w:rPr>
-      </w:pPr>
-      <w:r>
-        <w:rPr>
-          <w:rFonts w:ascii="Calibri" w:hAnsi="Calibri" w:cs="Calibri"/>
-          <w:sz w:val="22"/>
-        </w:rPr>
-        <w:t xml:space="preserve">  - </w:t>
-      </w:r>
-      <w:r>
-        <w:rPr>
-          <w:rFonts w:ascii="Consolas" w:hAnsi="Consolas" w:cs="Calibri"/>
-          <w:sz w:val="20"/>
-        </w:rPr>
-        <w:t>Microsoft.SemanticKernel.Connectors.Google</w:t>
+      <w:r>
+        <w:t xml:space="preserve">  - Microsoft.SemanticKernel.Core (the core SDK)</w:t>
+      </w:r>
+    </w:p>
+    <w:p>
+      <w:r>
+        <w:t xml:space="preserve">  - Microsoft.SemanticKernel.Connectors.Google</w:t>
       </w:r>
     </w:p>
     <w:p>
@@ -204,27 +87,12 @@
         <w:pStyle w:val="ListParagraph"/>
         <w:numPr>
           <w:ilvl w:val="0"/>
-          <w:numId w:val="2"/>
+          <w:numId w:val="5"/>
         </w:numPr>
-        <w:rPr>
-          <w:rFonts w:ascii="Calibri" w:hAnsi="Calibri" w:cs="Calibri"/>
-          <w:sz w:val="22"/>
-        </w:rPr>
-      </w:pPr>
-      <w:r>
-        <w:rPr>
-          <w:rFonts w:ascii="Calibri" w:hAnsi="Calibri" w:cs="Calibri"/>
-          <w:b/>
-          <w:sz w:val="22"/>
-        </w:rPr>
-        <w:t>API Key:</w:t>
-      </w:r>
-      <w:r>
-        <w:rPr>
-          <w:rFonts w:ascii="Calibri" w:hAnsi="Calibri" w:cs="Calibri"/>
-          <w:sz w:val="22"/>
-        </w:rPr>
-        <w:t xml:space="preserve"> A Google Gemini API key.</w:t>
+        <w:ind w:left="1080"/>
+      </w:pPr>
+      <w:r>
+        <w:t>API Key: A Google Gemini API key.</w:t>
       </w:r>
     </w:p>
     <w:p>
@@ -232,51 +100,15 @@
         <w:pStyle w:val="ListParagraph"/>
         <w:numPr>
           <w:ilvl w:val="0"/>
-          <w:numId w:val="2"/>
+          <w:numId w:val="5"/>
         </w:numPr>
-        <w:rPr>
-          <w:rFonts w:ascii="Calibri" w:hAnsi="Calibri" w:cs="Calibri"/>
-          <w:sz w:val="22"/>
-        </w:rPr>
-      </w:pPr>
-      <w:r>
-        <w:rPr>
-          <w:rFonts w:ascii="Calibri" w:hAnsi="Calibri" w:cs="Calibri"/>
-          <w:b/>
-          <w:sz w:val="22"/>
-        </w:rPr>
-        <w:t>Note:</w:t>
-      </w:r>
-      <w:r>
-        <w:rPr>
-          <w:rFonts w:ascii="Calibri" w:hAnsi="Calibri" w:cs="Calibri"/>
-          <w:sz w:val="22"/>
-        </w:rPr>
-        <w:t xml:space="preserve"> For security, the API key is read from the </w:t>
-      </w:r>
-      <w:r>
-        <w:rPr>
-          <w:rFonts w:ascii="Consolas" w:hAnsi="Consolas" w:cs="Calibri"/>
-          <w:sz w:val="20"/>
-        </w:rPr>
-        <w:t>GEMINI_API_KEY</w:t>
-      </w:r>
-      <w:r>
-        <w:rPr>
-          <w:rFonts w:ascii="Calibri" w:hAnsi="Calibri" w:cs="Calibri"/>
-          <w:sz w:val="22"/>
-        </w:rPr>
-        <w:t xml:space="preserve"> environment variable.</w:t>
-      </w:r>
-    </w:p>
-    <w:p>
-      <w:pPr>
-        <w:rPr>
-          <w:rFonts w:ascii="Calibri" w:hAnsi="Calibri" w:cs="Calibri"/>
-          <w:sz w:val="22"/>
-        </w:rPr>
-      </w:pPr>
-    </w:p>
+        <w:ind w:left="1080"/>
+      </w:pPr>
+      <w:r>
+        <w:t>Note: For security, the API key is read from the `GEMINI_API_KEY` environment variable rather than being hard-coded. If the variable is missing, the program throws an `InvalidOperationException` immediately instead of failing later with a confusing API error. The model used is `gemini-2.5-flash-lite`.</w:t>
+      </w:r>
+    </w:p>
+    <w:p/>
     <w:p>
       <w:pPr>
         <w:pStyle w:val="Heading2"/>
@@ -290,27 +122,18 @@
         <w:pStyle w:val="ListParagraph"/>
         <w:numPr>
           <w:ilvl w:val="0"/>
-          <w:numId w:val="3"/>
+          <w:numId w:val="6"/>
         </w:numPr>
-        <w:rPr>
-          <w:rFonts w:ascii="Calibri" w:hAnsi="Calibri" w:cs="Calibri"/>
-          <w:sz w:val="22"/>
-        </w:rPr>
-      </w:pPr>
-      <w:r>
-        <w:rPr>
-          <w:rFonts w:ascii="Calibri" w:hAnsi="Calibri" w:cs="Calibri"/>
+        <w:ind w:left="1080"/>
+      </w:pPr>
+      <w:r>
+        <w:rPr>
           <w:b/>
-          <w:sz w:val="22"/>
-        </w:rPr>
-        <w:t>The Kernel Builder:</w:t>
-      </w:r>
-      <w:r>
-        <w:rPr>
-          <w:rFonts w:ascii="Calibri" w:hAnsi="Calibri" w:cs="Calibri"/>
-          <w:sz w:val="22"/>
-        </w:rPr>
-        <w:t xml:space="preserve"> The factory used to configure and construct the Kernel.</w:t>
+        </w:rPr>
+        <w:t>The Kernel Builder</w:t>
+      </w:r>
+      <w:r>
+        <w:t>: `Kernel.CreateBuilder()` is the factory used to configure and construct the `Kernel` before any AI calls can be made.</w:t>
       </w:r>
     </w:p>
     <w:p>
@@ -318,27 +141,18 @@
         <w:pStyle w:val="ListParagraph"/>
         <w:numPr>
           <w:ilvl w:val="0"/>
-          <w:numId w:val="3"/>
+          <w:numId w:val="6"/>
         </w:numPr>
-        <w:rPr>
-          <w:rFonts w:ascii="Calibri" w:hAnsi="Calibri" w:cs="Calibri"/>
-          <w:sz w:val="22"/>
-        </w:rPr>
-      </w:pPr>
-      <w:r>
-        <w:rPr>
-          <w:rFonts w:ascii="Calibri" w:hAnsi="Calibri" w:cs="Calibri"/>
+        <w:ind w:left="1080"/>
+      </w:pPr>
+      <w:r>
+        <w:rPr>
           <w:b/>
-          <w:sz w:val="22"/>
-        </w:rPr>
-        <w:t>The Kernel:</w:t>
-      </w:r>
-      <w:r>
-        <w:rPr>
-          <w:rFonts w:ascii="Calibri" w:hAnsi="Calibri" w:cs="Calibri"/>
-          <w:sz w:val="22"/>
-        </w:rPr>
-        <w:t xml:space="preserve"> The central nervous system of your AI application. It holds all the services, plugins, and configurations.</w:t>
+        </w:rPr>
+        <w:t>The Kernel</w:t>
+      </w:r>
+      <w:r>
+        <w:t>: The central nervous system of your AI application. It holds all the services, plugins, and configurations that later code will draw on.</w:t>
       </w:r>
     </w:p>
     <w:p>
@@ -346,27 +160,19 @@
         <w:pStyle w:val="ListParagraph"/>
         <w:numPr>
           <w:ilvl w:val="0"/>
-          <w:numId w:val="3"/>
+          <w:numId w:val="6"/>
         </w:numPr>
-        <w:rPr>
-          <w:rFonts w:ascii="Calibri" w:hAnsi="Calibri" w:cs="Calibri"/>
-          <w:sz w:val="22"/>
-        </w:rPr>
-      </w:pPr>
-      <w:r>
-        <w:rPr>
-          <w:rFonts w:ascii="Calibri" w:hAnsi="Calibri" w:cs="Calibri"/>
+        <w:ind w:left="1080"/>
+      </w:pPr>
+      <w:r>
+        <w:rPr>
           <w:b/>
-          <w:sz w:val="22"/>
-        </w:rPr>
-        <w:t>IChatCompletionService:</w:t>
-      </w:r>
-      <w:r>
-        <w:rPr>
-          <w:rFonts w:ascii="Calibri" w:hAnsi="Calibri" w:cs="Calibri"/>
-          <w:sz w:val="22"/>
-        </w:rPr>
-        <w:t xml:space="preserve"> The specific abstraction Semantic Kernel uses to talk to chat-based LLMs. This interface decouples our code from Gemini specifically — if we later swap providers, only the one connector-registration line changes.</w:t>
+        </w:rPr>
+        <w:lastRenderedPageBreak/>
+        <w:t>AddGoogleAIGeminiChatCompletion</w:t>
+      </w:r>
+      <w:r>
+        <w:t>: The connector-registration call that attaches a specific model and API key to the builder, giving the otherwise "empty" kernel a brain.</w:t>
       </w:r>
     </w:p>
     <w:p>
@@ -374,52 +180,191 @@
         <w:pStyle w:val="ListParagraph"/>
         <w:numPr>
           <w:ilvl w:val="0"/>
-          <w:numId w:val="3"/>
+          <w:numId w:val="6"/>
         </w:numPr>
-        <w:rPr>
-          <w:rFonts w:ascii="Calibri" w:hAnsi="Calibri" w:cs="Calibri"/>
-          <w:sz w:val="22"/>
-        </w:rPr>
-      </w:pPr>
-      <w:r>
-        <w:rPr>
-          <w:rFonts w:ascii="Calibri" w:hAnsi="Calibri" w:cs="Calibri"/>
+        <w:ind w:left="1080"/>
+      </w:pPr>
+      <w:r>
+        <w:rPr>
           <w:b/>
-          <w:sz w:val="22"/>
-        </w:rPr>
-        <w:t>ChatHistory:</w:t>
-      </w:r>
-      <w:r>
-        <w:rPr>
-          <w:rFonts w:ascii="Calibri" w:hAnsi="Calibri" w:cs="Calibri"/>
-          <w:sz w:val="22"/>
-        </w:rPr>
-        <w:t xml:space="preserve"> An object that stores the ongoing conversation so the AI has context of what was said previously.</w:t>
-      </w:r>
-    </w:p>
-    <w:p>
-      <w:pPr>
-        <w:rPr>
-          <w:rFonts w:ascii="Calibri" w:hAnsi="Calibri" w:cs="Calibri"/>
-          <w:sz w:val="22"/>
-        </w:rPr>
-      </w:pPr>
-    </w:p>
+        </w:rPr>
+        <w:t>IChatCompletionService</w:t>
+      </w:r>
+      <w:r>
+        <w:t>: The abstraction Semantic Kernel uses to talk to chat-based LLMs. This interface decouples our code from Gemini specifically — if we later swap providers, only the one connector-registration line changes.</w:t>
+      </w:r>
+    </w:p>
+    <w:p>
+      <w:pPr>
+        <w:pStyle w:val="ListParagraph"/>
+        <w:numPr>
+          <w:ilvl w:val="0"/>
+          <w:numId w:val="6"/>
+        </w:numPr>
+        <w:ind w:left="1080"/>
+      </w:pPr>
+      <w:r>
+        <w:rPr>
+          <w:b/>
+        </w:rPr>
+        <w:t>ChatHistory</w:t>
+      </w:r>
+      <w:r>
+        <w:t>: An object that stores the ongoing conversation (including a system prompt) so the AI has context of what was said previously.</w:t>
+      </w:r>
+    </w:p>
+    <w:p>
+      <w:pPr>
+        <w:pStyle w:val="ListParagraph"/>
+        <w:numPr>
+          <w:ilvl w:val="0"/>
+          <w:numId w:val="6"/>
+        </w:numPr>
+        <w:ind w:left="1080"/>
+      </w:pPr>
+      <w:r>
+        <w:rPr>
+          <w:b/>
+        </w:rPr>
+        <w:t>The Conversation Loop</w:t>
+      </w:r>
+      <w:r>
+        <w:t>: A `while(true)` console loop that turns a single request/response call into a continuous, stateful chat experience.</w:t>
+      </w:r>
+    </w:p>
+    <w:p/>
     <w:p>
       <w:pPr>
         <w:pStyle w:val="Heading2"/>
       </w:pPr>
       <w:r>
-        <w:t>4. Complete C# Code (Program.cs)</w:t>
-      </w:r>
-    </w:p>
-    <w:p>
-      <w:pPr>
-        <w:rPr>
-          <w:rFonts w:ascii="Calibri" w:hAnsi="Calibri" w:cs="Calibri"/>
-          <w:sz w:val="22"/>
-        </w:rPr>
-      </w:pPr>
+        <w:t>4. Complete Code</w:t>
+      </w:r>
+    </w:p>
+    <w:p>
+      <w:pPr>
+        <w:rPr>
+          <w:b/>
+        </w:rPr>
+      </w:pPr>
+      <w:r>
+        <w:rPr>
+          <w:b/>
+        </w:rPr>
+        <w:t>Program.cs</w:t>
+      </w:r>
+    </w:p>
+    <w:p>
+      <w:pPr>
+        <w:pStyle w:val="NoSpacing"/>
+        <w:rPr>
+          <w:rFonts w:ascii="Consolas" w:hAnsi="Consolas"/>
+          <w:sz w:val="19"/>
+        </w:rPr>
+      </w:pPr>
+      <w:r>
+        <w:rPr>
+          <w:rFonts w:ascii="Consolas" w:hAnsi="Consolas"/>
+          <w:sz w:val="19"/>
+        </w:rPr>
+        <w:t>// Day 1: The Conversationalist</w:t>
+      </w:r>
+    </w:p>
+    <w:p>
+      <w:pPr>
+        <w:pStyle w:val="NoSpacing"/>
+        <w:rPr>
+          <w:rFonts w:ascii="Consolas" w:hAnsi="Consolas"/>
+          <w:sz w:val="19"/>
+        </w:rPr>
+      </w:pPr>
+      <w:r>
+        <w:rPr>
+          <w:rFonts w:ascii="Consolas" w:hAnsi="Consolas"/>
+          <w:sz w:val="19"/>
+        </w:rPr>
+        <w:t>// ---------------------------------------------------------------------------</w:t>
+      </w:r>
+    </w:p>
+    <w:p>
+      <w:pPr>
+        <w:pStyle w:val="NoSpacing"/>
+        <w:rPr>
+          <w:rFonts w:ascii="Consolas" w:hAnsi="Consolas"/>
+          <w:sz w:val="19"/>
+        </w:rPr>
+      </w:pPr>
+      <w:r>
+        <w:rPr>
+          <w:rFonts w:ascii="Consolas" w:hAnsi="Consolas"/>
+          <w:sz w:val="19"/>
+        </w:rPr>
+        <w:t>// The first project in the series - a continuous, terminal-based chatbot.</w:t>
+      </w:r>
+    </w:p>
+    <w:p>
+      <w:pPr>
+        <w:pStyle w:val="NoSpacing"/>
+        <w:rPr>
+          <w:rFonts w:ascii="Consolas" w:hAnsi="Consolas"/>
+          <w:sz w:val="19"/>
+        </w:rPr>
+      </w:pPr>
+      <w:r>
+        <w:rPr>
+          <w:rFonts w:ascii="Consolas" w:hAnsi="Consolas"/>
+          <w:sz w:val="19"/>
+        </w:rPr>
+        <w:t>// Demonstrates the core Semantic Kernel building blocks every later episode</w:t>
+      </w:r>
+    </w:p>
+    <w:p>
+      <w:pPr>
+        <w:pStyle w:val="NoSpacing"/>
+        <w:rPr>
+          <w:rFonts w:ascii="Consolas" w:hAnsi="Consolas"/>
+          <w:sz w:val="19"/>
+        </w:rPr>
+      </w:pPr>
+      <w:r>
+        <w:rPr>
+          <w:rFonts w:ascii="Consolas" w:hAnsi="Consolas"/>
+          <w:sz w:val="19"/>
+        </w:rPr>
+        <w:t>// builds on: Kernel.CreateBuilder(), a chat completion connector,</w:t>
+      </w:r>
+    </w:p>
+    <w:p>
+      <w:pPr>
+        <w:pStyle w:val="NoSpacing"/>
+        <w:rPr>
+          <w:rFonts w:ascii="Consolas" w:hAnsi="Consolas"/>
+          <w:sz w:val="19"/>
+        </w:rPr>
+      </w:pPr>
+      <w:r>
+        <w:rPr>
+          <w:rFonts w:ascii="Consolas" w:hAnsi="Consolas"/>
+          <w:sz w:val="19"/>
+        </w:rPr>
+        <w:t>// IChatCompletionService, and a ChatHistory object that gives the model</w:t>
+      </w:r>
+    </w:p>
+    <w:p>
+      <w:pPr>
+        <w:pStyle w:val="NoSpacing"/>
+        <w:rPr>
+          <w:rFonts w:ascii="Consolas" w:hAnsi="Consolas"/>
+          <w:sz w:val="19"/>
+        </w:rPr>
+      </w:pPr>
+      <w:r>
+        <w:rPr>
+          <w:rFonts w:ascii="Consolas" w:hAnsi="Consolas"/>
+          <w:sz w:val="19"/>
+        </w:rPr>
+        <w:t>// memory of the conversation across turns.</w:t>
+      </w:r>
     </w:p>
     <w:p>
       <w:pPr>
@@ -571,7 +516,23 @@
           <w:rFonts w:ascii="Consolas" w:hAnsi="Consolas"/>
           <w:sz w:val="19"/>
         </w:rPr>
-        <w:t xml:space="preserve">            // Step 1: Setup a kernel builder</w:t>
+        <w:t xml:space="preserve">            // Step 1: Setup a kernel builder - the factory used to configure</w:t>
+      </w:r>
+    </w:p>
+    <w:p>
+      <w:pPr>
+        <w:pStyle w:val="NoSpacing"/>
+        <w:rPr>
+          <w:rFonts w:ascii="Consolas" w:hAnsi="Consolas"/>
+          <w:sz w:val="19"/>
+        </w:rPr>
+      </w:pPr>
+      <w:r>
+        <w:rPr>
+          <w:rFonts w:ascii="Consolas" w:hAnsi="Consolas"/>
+          <w:sz w:val="19"/>
+        </w:rPr>
+        <w:t xml:space="preserve">            // and construct the Kernel (the app's central AI service registry)</w:t>
       </w:r>
     </w:p>
     <w:p>
@@ -849,6 +810,54 @@
           <w:rFonts w:ascii="Consolas" w:hAnsi="Consolas"/>
           <w:sz w:val="19"/>
         </w:rPr>
+        <w:t xml:space="preserve">            // Step 6: The conversation loop - reads a line from the console,</w:t>
+      </w:r>
+    </w:p>
+    <w:p>
+      <w:pPr>
+        <w:pStyle w:val="NoSpacing"/>
+        <w:rPr>
+          <w:rFonts w:ascii="Consolas" w:hAnsi="Consolas"/>
+          <w:sz w:val="19"/>
+        </w:rPr>
+      </w:pPr>
+      <w:r>
+        <w:rPr>
+          <w:rFonts w:ascii="Consolas" w:hAnsi="Consolas"/>
+          <w:sz w:val="19"/>
+        </w:rPr>
+        <w:t xml:space="preserve">            // hands it to the model along with the running history, prints</w:t>
+      </w:r>
+    </w:p>
+    <w:p>
+      <w:pPr>
+        <w:pStyle w:val="NoSpacing"/>
+        <w:rPr>
+          <w:rFonts w:ascii="Consolas" w:hAnsi="Consolas"/>
+          <w:sz w:val="19"/>
+        </w:rPr>
+      </w:pPr>
+      <w:r>
+        <w:rPr>
+          <w:rFonts w:ascii="Consolas" w:hAnsi="Consolas"/>
+          <w:sz w:val="19"/>
+        </w:rPr>
+        <w:t xml:space="preserve">            // the reply, and repeats until the user types "exit"</w:t>
+      </w:r>
+    </w:p>
+    <w:p>
+      <w:pPr>
+        <w:pStyle w:val="NoSpacing"/>
+        <w:rPr>
+          <w:rFonts w:ascii="Consolas" w:hAnsi="Consolas"/>
+          <w:sz w:val="19"/>
+        </w:rPr>
+      </w:pPr>
+      <w:r>
+        <w:rPr>
+          <w:rFonts w:ascii="Consolas" w:hAnsi="Consolas"/>
+          <w:sz w:val="19"/>
+        </w:rPr>
         <w:t xml:space="preserve">            while(true)</w:t>
       </w:r>
     </w:p>
@@ -1175,6 +1184,54 @@
           <w:rFonts w:ascii="Consolas" w:hAnsi="Consolas"/>
           <w:sz w:val="19"/>
         </w:rPr>
+        <w:t xml:space="preserve">                // This step is not optional: if the assistant's reply is never</w:t>
+      </w:r>
+    </w:p>
+    <w:p>
+      <w:pPr>
+        <w:pStyle w:val="NoSpacing"/>
+        <w:rPr>
+          <w:rFonts w:ascii="Consolas" w:hAnsi="Consolas"/>
+          <w:sz w:val="19"/>
+        </w:rPr>
+      </w:pPr>
+      <w:r>
+        <w:rPr>
+          <w:rFonts w:ascii="Consolas" w:hAnsi="Consolas"/>
+          <w:sz w:val="19"/>
+        </w:rPr>
+        <w:t xml:space="preserve">                // added back to the history, the model has no memory of its</w:t>
+      </w:r>
+    </w:p>
+    <w:p>
+      <w:pPr>
+        <w:pStyle w:val="NoSpacing"/>
+        <w:rPr>
+          <w:rFonts w:ascii="Consolas" w:hAnsi="Consolas"/>
+          <w:sz w:val="19"/>
+        </w:rPr>
+      </w:pPr>
+      <w:r>
+        <w:rPr>
+          <w:rFonts w:ascii="Consolas" w:hAnsi="Consolas"/>
+          <w:sz w:val="19"/>
+        </w:rPr>
+        <w:t xml:space="preserve">                // own previous answers and the conversation loses context.</w:t>
+      </w:r>
+    </w:p>
+    <w:p>
+      <w:pPr>
+        <w:pStyle w:val="NoSpacing"/>
+        <w:rPr>
+          <w:rFonts w:ascii="Consolas" w:hAnsi="Consolas"/>
+          <w:sz w:val="19"/>
+        </w:rPr>
+      </w:pPr>
+      <w:r>
+        <w:rPr>
+          <w:rFonts w:ascii="Consolas" w:hAnsi="Consolas"/>
+          <w:sz w:val="19"/>
+        </w:rPr>
         <w:t xml:space="preserve">                if (response.Content != null)</w:t>
       </w:r>
     </w:p>
@@ -1290,14 +1347,7 @@
         <w:t>}</w:t>
       </w:r>
     </w:p>
-    <w:p>
-      <w:pPr>
-        <w:rPr>
-          <w:rFonts w:ascii="Calibri" w:hAnsi="Calibri" w:cs="Calibri"/>
-          <w:sz w:val="22"/>
-        </w:rPr>
-      </w:pPr>
-    </w:p>
+    <w:p/>
     <w:p>
       <w:pPr>
         <w:pStyle w:val="Heading2"/>
@@ -1307,287 +1357,69 @@
       </w:r>
     </w:p>
     <w:p>
-      <w:pPr>
-        <w:rPr>
-          <w:rFonts w:ascii="Calibri" w:hAnsi="Calibri" w:cs="Calibri"/>
-          <w:sz w:val="22"/>
-        </w:rPr>
-      </w:pPr>
-      <w:r>
-        <w:rPr>
-          <w:rFonts w:ascii="Calibri" w:hAnsi="Calibri" w:cs="Calibri"/>
+      <w:r>
+        <w:rPr>
           <w:b/>
-          <w:sz w:val="22"/>
         </w:rPr>
         <w:t>Steps 1 &amp; 2: The Builder and the Service.</w:t>
       </w:r>
       <w:r>
-        <w:rPr>
-          <w:rFonts w:ascii="Calibri" w:hAnsi="Calibri" w:cs="Calibri"/>
-          <w:sz w:val="22"/>
-        </w:rPr>
-        <w:t xml:space="preserve"> Semantic Kernel utilizes the standard .NET Builder pattern. We call </w:t>
-      </w:r>
-      <w:r>
-        <w:rPr>
-          <w:rFonts w:ascii="Consolas" w:hAnsi="Consolas" w:cs="Calibri"/>
-          <w:sz w:val="20"/>
-        </w:rPr>
-        <w:t>Kernel.CreateBuilder()</w:t>
-      </w:r>
-      <w:r>
-        <w:rPr>
-          <w:rFonts w:ascii="Calibri" w:hAnsi="Calibri" w:cs="Calibri"/>
-          <w:sz w:val="22"/>
-        </w:rPr>
-        <w:t xml:space="preserve"> to start, then attach our "Engine" to it using </w:t>
-      </w:r>
-      <w:r>
-        <w:rPr>
-          <w:rFonts w:ascii="Consolas" w:hAnsi="Consolas" w:cs="Calibri"/>
-          <w:sz w:val="20"/>
-        </w:rPr>
-        <w:t>AddGoogleAIGeminiChatCompletion()</w:t>
-      </w:r>
-      <w:r>
-        <w:rPr>
-          <w:rFonts w:ascii="Calibri" w:hAnsi="Calibri" w:cs="Calibri"/>
-          <w:sz w:val="22"/>
-        </w:rPr>
-        <w:t>. The Kernel itself doesn't have a brain; it's a framework. By adding the Gemini Chat Completion service, we give it a specific model and the authentication key to perform the thinking.</w:t>
-      </w:r>
-    </w:p>
-    <w:p>
-      <w:pPr>
-        <w:rPr>
-          <w:rFonts w:ascii="Calibri" w:hAnsi="Calibri" w:cs="Calibri"/>
-          <w:sz w:val="22"/>
-        </w:rPr>
-      </w:pPr>
-    </w:p>
-    <w:p>
-      <w:pPr>
-        <w:rPr>
-          <w:rFonts w:ascii="Calibri" w:hAnsi="Calibri" w:cs="Calibri"/>
-          <w:sz w:val="22"/>
-        </w:rPr>
-      </w:pPr>
-      <w:r>
-        <w:rPr>
-          <w:rFonts w:ascii="Calibri" w:hAnsi="Calibri" w:cs="Calibri"/>
+        <w:t xml:space="preserve"> Semantic Kernel utilizes the standard .NET Builder pattern. We call `Kernel.CreateBuilder()` to start, then attach our "Engine" to it using `AddGoogleAIGeminiChatCompletion()`. The Kernel itself doesn't have a brain; it's a framework. By adding the Gemini Chat Completion service, along with the model ID </w:t>
+      </w:r>
+      <w:r>
+        <w:lastRenderedPageBreak/>
+        <w:t>(`gemini-2.5-flash-lite`) and the authentication key pulled from the `GEMINI_API_KEY` environment variable, we give the kernel a specific model to perform the thinking.</w:t>
+      </w:r>
+    </w:p>
+    <w:p/>
+    <w:p>
+      <w:r>
+        <w:rPr>
           <w:b/>
-          <w:sz w:val="22"/>
         </w:rPr>
         <w:t>Step 3: Building the Kernel.</w:t>
       </w:r>
       <w:r>
-        <w:rPr>
-          <w:rFonts w:ascii="Calibri" w:hAnsi="Calibri" w:cs="Calibri"/>
-          <w:sz w:val="22"/>
-        </w:rPr>
-        <w:t xml:space="preserve"> Once all services and configurations are attached to the builder, we call </w:t>
-      </w:r>
-      <w:r>
-        <w:rPr>
-          <w:rFonts w:ascii="Consolas" w:hAnsi="Consolas" w:cs="Calibri"/>
-          <w:sz w:val="20"/>
-        </w:rPr>
-        <w:t>.Build()</w:t>
-      </w:r>
-      <w:r>
-        <w:rPr>
-          <w:rFonts w:ascii="Calibri" w:hAnsi="Calibri" w:cs="Calibri"/>
-          <w:sz w:val="22"/>
-        </w:rPr>
-        <w:t>. This yields the kernel object, which we pass around to our various AI tasks.</w:t>
-      </w:r>
-    </w:p>
-    <w:p>
-      <w:pPr>
-        <w:rPr>
-          <w:rFonts w:ascii="Calibri" w:hAnsi="Calibri" w:cs="Calibri"/>
-          <w:sz w:val="22"/>
-        </w:rPr>
-      </w:pPr>
-    </w:p>
-    <w:p>
-      <w:pPr>
-        <w:rPr>
-          <w:rFonts w:ascii="Calibri" w:hAnsi="Calibri" w:cs="Calibri"/>
-          <w:sz w:val="22"/>
-        </w:rPr>
-      </w:pPr>
-      <w:r>
-        <w:rPr>
-          <w:rFonts w:ascii="Calibri" w:hAnsi="Calibri" w:cs="Calibri"/>
+        <w:t xml:space="preserve"> Once all services and configurations are attached to the builder, we call `.Build()`. This yields the `kernel` object, which we pass around to our various AI tasks for the rest of the program's life.</w:t>
+      </w:r>
+    </w:p>
+    <w:p/>
+    <w:p>
+      <w:r>
+        <w:rPr>
           <w:b/>
-          <w:sz w:val="22"/>
         </w:rPr>
         <w:t>Step 4: Extracting the Chat Service.</w:t>
       </w:r>
       <w:r>
-        <w:rPr>
-          <w:rFonts w:ascii="Calibri" w:hAnsi="Calibri" w:cs="Calibri"/>
-          <w:sz w:val="22"/>
-        </w:rPr>
-        <w:t xml:space="preserve"> Because the Kernel acts as a Dependency Injection (DI) container, we extract the </w:t>
-      </w:r>
-      <w:r>
-        <w:rPr>
-          <w:rFonts w:ascii="Consolas" w:hAnsi="Consolas" w:cs="Calibri"/>
-          <w:sz w:val="20"/>
-        </w:rPr>
-        <w:t>IChatCompletionService</w:t>
-      </w:r>
-      <w:r>
-        <w:rPr>
-          <w:rFonts w:ascii="Calibri" w:hAnsi="Calibri" w:cs="Calibri"/>
-          <w:sz w:val="22"/>
-        </w:rPr>
-        <w:t>. This interface is highly important: it decouples our code from Gemini specifically. If we later decide to swap providers, we just change Step 2 — the rest of our code relies on this interface and doesn't need to change.</w:t>
-      </w:r>
-    </w:p>
-    <w:p>
-      <w:pPr>
-        <w:rPr>
-          <w:rFonts w:ascii="Calibri" w:hAnsi="Calibri" w:cs="Calibri"/>
-          <w:sz w:val="22"/>
-        </w:rPr>
-      </w:pPr>
-    </w:p>
-    <w:p>
-      <w:pPr>
-        <w:rPr>
-          <w:rFonts w:ascii="Calibri" w:hAnsi="Calibri" w:cs="Calibri"/>
-          <w:sz w:val="22"/>
-        </w:rPr>
-      </w:pPr>
-      <w:r>
-        <w:rPr>
-          <w:rFonts w:ascii="Calibri" w:hAnsi="Calibri" w:cs="Calibri"/>
+        <w:t xml:space="preserve"> Because the Kernel acts as a Dependency Injection (DI) container, we extract the `IChatCompletionService` from it via `GetRequiredService&lt;T&gt;()`. This interface is highly important: it decouples our code from Gemini specifically. If we later decide to swap providers, we just change Step 2 — the rest of our code relies on this interface and doesn't need to change.</w:t>
+      </w:r>
+    </w:p>
+    <w:p/>
+    <w:p>
+      <w:r>
+        <w:rPr>
           <w:b/>
-          <w:sz w:val="22"/>
         </w:rPr>
         <w:t>Step 5: The Chat History.</w:t>
       </w:r>
       <w:r>
-        <w:rPr>
-          <w:rFonts w:ascii="Calibri" w:hAnsi="Calibri" w:cs="Calibri"/>
-          <w:sz w:val="22"/>
-        </w:rPr>
-        <w:t xml:space="preserve"> LLMs are inherently stateless. </w:t>
-      </w:r>
-      <w:r>
-        <w:rPr>
-          <w:rFonts w:ascii="Consolas" w:hAnsi="Consolas" w:cs="Calibri"/>
-          <w:sz w:val="20"/>
-        </w:rPr>
-        <w:t>ChatHistory</w:t>
-      </w:r>
-      <w:r>
-        <w:rPr>
-          <w:rFonts w:ascii="Calibri" w:hAnsi="Calibri" w:cs="Calibri"/>
-          <w:sz w:val="22"/>
-        </w:rPr>
-        <w:t xml:space="preserve"> handles conversation payload management for us. We initialize it with a system prompt, which dictates the AI's persona.</w:t>
-      </w:r>
-    </w:p>
-    <w:p>
-      <w:pPr>
-        <w:rPr>
-          <w:rFonts w:ascii="Calibri" w:hAnsi="Calibri" w:cs="Calibri"/>
-          <w:sz w:val="22"/>
-        </w:rPr>
-      </w:pPr>
-    </w:p>
-    <w:p>
-      <w:pPr>
-        <w:rPr>
-          <w:rFonts w:ascii="Calibri" w:hAnsi="Calibri" w:cs="Calibri"/>
-          <w:sz w:val="22"/>
-        </w:rPr>
-      </w:pPr>
-      <w:r>
-        <w:rPr>
-          <w:rFonts w:ascii="Calibri" w:hAnsi="Calibri" w:cs="Calibri"/>
+        <w:t xml:space="preserve"> LLMs are inherently stateless — each API call is independent and has no memory of prior calls. `ChatHistory` handles conversation payload management for us. We initialize it with a system prompt ("You are a helpful, friendly, and concise AI Assistant."), which dictates the AI's persona for the entire session.</w:t>
+      </w:r>
+    </w:p>
+    <w:p/>
+    <w:p>
+      <w:r>
+        <w:rPr>
           <w:b/>
-          <w:sz w:val="22"/>
         </w:rPr>
         <w:t>Step 6: The Conversation Loop.</w:t>
       </w:r>
       <w:r>
-        <w:rPr>
-          <w:rFonts w:ascii="Calibri" w:hAnsi="Calibri" w:cs="Calibri"/>
-          <w:sz w:val="22"/>
-        </w:rPr>
-        <w:t xml:space="preserve"> We wrap the interaction in a </w:t>
-      </w:r>
-      <w:r>
-        <w:rPr>
-          <w:rFonts w:ascii="Consolas" w:hAnsi="Consolas" w:cs="Calibri"/>
-          <w:sz w:val="20"/>
-        </w:rPr>
-        <w:t>while(true)</w:t>
-      </w:r>
-      <w:r>
-        <w:rPr>
-          <w:rFonts w:ascii="Calibri" w:hAnsi="Calibri" w:cs="Calibri"/>
-          <w:sz w:val="22"/>
-        </w:rPr>
-        <w:t xml:space="preserve"> loop to create a continuous application. We </w:t>
-      </w:r>
-      <w:r>
-        <w:rPr>
-          <w:rFonts w:ascii="Calibri" w:hAnsi="Calibri" w:cs="Calibri"/>
-          <w:b/>
-          <w:sz w:val="22"/>
-        </w:rPr>
-        <w:t>must</w:t>
-      </w:r>
-      <w:r>
-        <w:rPr>
-          <w:rFonts w:ascii="Calibri" w:hAnsi="Calibri" w:cs="Calibri"/>
-          <w:sz w:val="22"/>
-        </w:rPr>
-        <w:t xml:space="preserve"> append the AI's response back into </w:t>
-      </w:r>
-      <w:r>
-        <w:rPr>
-          <w:rFonts w:ascii="Consolas" w:hAnsi="Consolas" w:cs="Calibri"/>
-          <w:sz w:val="20"/>
-        </w:rPr>
-        <w:t>chatHistory</w:t>
-      </w:r>
-      <w:r>
-        <w:rPr>
-          <w:rFonts w:ascii="Calibri" w:hAnsi="Calibri" w:cs="Calibri"/>
-          <w:sz w:val="22"/>
-        </w:rPr>
-        <w:t xml:space="preserve"> using </w:t>
-      </w:r>
-      <w:r>
-        <w:rPr>
-          <w:rFonts w:ascii="Consolas" w:hAnsi="Consolas" w:cs="Calibri"/>
-          <w:sz w:val="20"/>
-        </w:rPr>
-        <w:t>.AddAssistantMessage()</w:t>
-      </w:r>
-      <w:r>
-        <w:rPr>
-          <w:rFonts w:ascii="Calibri" w:hAnsi="Calibri" w:cs="Calibri"/>
-          <w:sz w:val="22"/>
-        </w:rPr>
-        <w:t xml:space="preserve"> — if we forget this step, the AI will sound like it has amnesia, forgetting its own answers in subsequent turns.</w:t>
-      </w:r>
-    </w:p>
-    <w:p>
-      <w:pPr>
-        <w:rPr>
-          <w:rFonts w:ascii="Calibri" w:hAnsi="Calibri" w:cs="Calibri"/>
-          <w:sz w:val="22"/>
-        </w:rPr>
-      </w:pPr>
-    </w:p>
+        <w:t xml:space="preserve"> We wrap the interaction in a `while(true)` loop to create a continuous application. Empty input is silently skipped via `continue`, and typing "exit" (case-insensitively) breaks out of the loop. Every real user message is appended to `chatHistory` with `AddUserMessage()` before being sent to `GetChatMessageContentAsync()`. Critically, we must also append the AI's response back into `chatHistory` using `AddAssistantMessage()` — if we forget this step, the AI will sound like it has amnesia, forgetting its own answers in subsequent turns because the history sent on the next call won't contain them.</w:t>
+      </w:r>
+    </w:p>
+    <w:p/>
     <w:p>
       <w:pPr>
         <w:pStyle w:val="Heading2"/>
@@ -1598,24 +1430,26 @@
     </w:p>
     <w:p>
       <w:pPr>
-        <w:rPr>
-          <w:rFonts w:ascii="Calibri" w:hAnsi="Calibri" w:cs="Calibri"/>
-          <w:sz w:val="22"/>
-        </w:rPr>
-      </w:pPr>
-      <w:r>
-        <w:rPr>
-          <w:rFonts w:ascii="Calibri" w:hAnsi="Calibri" w:cs="Calibri"/>
-          <w:sz w:val="22"/>
-        </w:rPr>
-        <w:t>Demo Transcript:</w:t>
-      </w:r>
-    </w:p>
-    <w:p>
-      <w:pPr>
-        <w:rPr>
-          <w:rFonts w:ascii="Calibri" w:hAnsi="Calibri" w:cs="Calibri"/>
-          <w:sz w:val="22"/>
+        <w:pStyle w:val="NoSpacing"/>
+        <w:rPr>
+          <w:rFonts w:ascii="Consolas" w:hAnsi="Consolas"/>
+          <w:sz w:val="19"/>
+        </w:rPr>
+      </w:pPr>
+      <w:r>
+        <w:rPr>
+          <w:rFonts w:ascii="Consolas" w:hAnsi="Consolas"/>
+          <w:sz w:val="19"/>
+        </w:rPr>
+        <w:t>Chatbot initialized.  Type 'exit' to quit</w:t>
+      </w:r>
+    </w:p>
+    <w:p>
+      <w:pPr>
+        <w:pStyle w:val="NoSpacing"/>
+        <w:rPr>
+          <w:rFonts w:ascii="Consolas" w:hAnsi="Consolas"/>
+          <w:sz w:val="19"/>
         </w:rPr>
       </w:pPr>
     </w:p>
@@ -1648,8 +1482,17 @@
           <w:rFonts w:ascii="Consolas" w:hAnsi="Consolas"/>
           <w:sz w:val="19"/>
         </w:rPr>
-        <w:t>AI: Nice to meet you, Alice! It's great to know your favorite color is blue. How can I help you today?</w:t>
-      </w:r>
+        <w:t>AI response: Nice to meet you, Alice! It's great to know your favorite color is blue. How can I help you today?</w:t>
+      </w:r>
+    </w:p>
+    <w:p>
+      <w:pPr>
+        <w:pStyle w:val="NoSpacing"/>
+        <w:rPr>
+          <w:rFonts w:ascii="Consolas" w:hAnsi="Consolas"/>
+          <w:sz w:val="19"/>
+        </w:rPr>
+      </w:pPr>
     </w:p>
     <w:p>
       <w:pPr>
@@ -1680,17 +1523,49 @@
           <w:rFonts w:ascii="Consolas" w:hAnsi="Consolas"/>
           <w:sz w:val="19"/>
         </w:rPr>
-        <w:t>AI: Your name is Alice, and your favorite color is blue!</w:t>
-      </w:r>
-    </w:p>
-    <w:p>
-      <w:pPr>
-        <w:pStyle w:val="NoSpacing"/>
-        <w:rPr>
-          <w:rFonts w:ascii="Consolas" w:hAnsi="Consolas"/>
-          <w:sz w:val="19"/>
-        </w:rPr>
-      </w:pPr>
+        <w:t>AI response: Your name is Alice, and your favorite color is blue!</w:t>
+      </w:r>
+    </w:p>
+    <w:p>
+      <w:pPr>
+        <w:pStyle w:val="NoSpacing"/>
+        <w:rPr>
+          <w:rFonts w:ascii="Consolas" w:hAnsi="Consolas"/>
+          <w:sz w:val="19"/>
+        </w:rPr>
+      </w:pPr>
+    </w:p>
+    <w:p>
+      <w:pPr>
+        <w:pStyle w:val="NoSpacing"/>
+        <w:rPr>
+          <w:rFonts w:ascii="Consolas" w:hAnsi="Consolas"/>
+          <w:sz w:val="19"/>
+        </w:rPr>
+      </w:pPr>
+      <w:r>
+        <w:rPr>
+          <w:rFonts w:ascii="Consolas" w:hAnsi="Consolas"/>
+          <w:sz w:val="19"/>
+        </w:rPr>
+        <w:t>User: exit</w:t>
+      </w:r>
+    </w:p>
+    <w:p>
+      <w:pPr>
+        <w:pStyle w:val="NoSpacing"/>
+        <w:rPr>
+          <w:rFonts w:ascii="Consolas" w:hAnsi="Consolas"/>
+          <w:sz w:val="19"/>
+        </w:rPr>
+      </w:pPr>
+      <w:r>
+        <w:rPr>
+          <w:rFonts w:ascii="Consolas" w:hAnsi="Consolas"/>
+          <w:sz w:val="19"/>
+        </w:rPr>
+        <w:t>Exiting the chat. Goodbye!</w:t>
+      </w:r>
     </w:p>
     <w:sectPr>
       <w:pgSz w:w="12240" w:h="15840"/>
@@ -1705,6 +1580,23 @@
 <file path=word/numbering.xml><?xml version="1.0" encoding="utf-8"?>
 <w:numbering xmlns:wpc="http://schemas.microsoft.com/office/word/2010/wordprocessingCanvas" xmlns:cx="http://schemas.microsoft.com/office/drawing/2014/chartex" xmlns:cx1="http://schemas.microsoft.com/office/drawing/2015/9/8/chartex" xmlns:cx2="http://schemas.microsoft.com/office/drawing/2015/10/21/chartex" xmlns:cx3="http://schemas.microsoft.com/office/drawing/2016/5/9/chartex" xmlns:cx4="http://schemas.microsoft.com/office/drawing/2016/5/10/chartex" xmlns:cx5="http://schemas.microsoft.com/office/drawing/2016/5/11/chartex" xmlns:cx6="http://schemas.microsoft.com/office/drawing/2016/5/12/chartex" xmlns:cx7="http://schemas.microsoft.com/office/drawing/2016/5/13/chartex" xmlns:cx8="http://schemas.microsoft.com/office/drawing/2016/5/14/chartex" xmlns:mc="http://schemas.openxmlformats.org/markup-compatibility/2006" xmlns:aink="http://schemas.microsoft.com/office/drawing/2016/ink" xmlns:am3d="http://schemas.microsoft.com/office/drawing/2017/model3d" xmlns:o="urn:schemas-microsoft-com:office:office" xmlns:oel="http://schemas.microsoft.com/office/2019/extlst" xmlns:r="http://schemas.openxmlformats.org/officeDocument/2006/relationships" xmlns:m="http://schemas.openxmlformats.org/officeDocument/2006/math" xmlns:v="urn:schemas-microsoft-com:vml" xmlns:wp14="http://schemas.microsoft.com/office/word/2010/wordprocessingDrawing" xmlns:wp="http://schemas.openxmlformats.org/drawingml/2006/wordprocessingDrawing" xmlns:w10="urn:schemas-microsoft-com:office:word" xmlns:w="http://schemas.openxmlformats.org/wordprocessingml/2006/main" xmlns:w14="http://schemas.microsoft.com/office/word/2010/wordml" xmlns:w15="http://schemas.microsoft.com/office/word/2012/wordml" xmlns:w16cei="http://schemas.microsoft.com/office/word/2026/wordml/cei" xmlns:w16cex="http://schemas.microsoft.com/office/word/2018/wordml/cex" xmlns:w16cid="http://schemas.microsoft.com/office/word/2016/wordml/cid" xmlns:w16="http://schemas.microsoft.com/office/word/2018/wordml" xmlns:w16du="http://schemas.microsoft.com/office/word/2023/wordml/word16du" xmlns:w16sdtdh="http://schemas.microsoft.com/office/word/2020/wordml/sdtdatahash" xmlns:w16sdtfl="http://schemas.microsoft.com/office/word/2024/wordml/sdtformatlock" xmlns:w16se="http://schemas.microsoft.com/office/word/2015/wordml/symex" xmlns:wpg="http://schemas.microsoft.com/office/word/2010/wordprocessingGroup" xmlns:wpi="http://schemas.microsoft.com/office/word/2010/wordprocessingInk" xmlns:wne="http://schemas.microsoft.com/office/word/2006/wordml" xmlns:wps="http://schemas.microsoft.com/office/word/2010/wordprocessingShape" mc:Ignorable="w14 w15 w16se w16cid w16 w16cex w16sdtdh w16sdtfl w16du wp14">
   <w:abstractNum w:abstractNumId="0" w15:restartNumberingAfterBreak="0">
+    <w:nsid w:val="24010276"/>
+    <w:multiLevelType w:val="singleLevel"/>
+    <w:tmpl w:val="04090001"/>
+    <w:lvl w:ilvl="0">
+      <w:start w:val="1"/>
+      <w:numFmt w:val="bullet"/>
+      <w:lvlText w:val=""/>
+      <w:lvlJc w:val="left"/>
+      <w:pPr>
+        <w:ind w:left="720" w:hanging="360"/>
+      </w:pPr>
+      <w:rPr>
+        <w:rFonts w:ascii="Symbol" w:hAnsi="Symbol" w:hint="default"/>
+      </w:rPr>
+    </w:lvl>
+  </w:abstractNum>
+  <w:abstractNum w:abstractNumId="1" w15:restartNumberingAfterBreak="0">
     <w:nsid w:val="29513C67"/>
     <w:multiLevelType w:val="singleLevel"/>
     <w:tmpl w:val="04090001"/>
@@ -1721,7 +1613,41 @@
       </w:rPr>
     </w:lvl>
   </w:abstractNum>
-  <w:abstractNum w:abstractNumId="1" w15:restartNumberingAfterBreak="0">
+  <w:abstractNum w:abstractNumId="2" w15:restartNumberingAfterBreak="0">
+    <w:nsid w:val="43415B86"/>
+    <w:multiLevelType w:val="singleLevel"/>
+    <w:tmpl w:val="04090001"/>
+    <w:lvl w:ilvl="0">
+      <w:start w:val="1"/>
+      <w:numFmt w:val="bullet"/>
+      <w:lvlText w:val=""/>
+      <w:lvlJc w:val="left"/>
+      <w:pPr>
+        <w:ind w:left="720" w:hanging="360"/>
+      </w:pPr>
+      <w:rPr>
+        <w:rFonts w:ascii="Symbol" w:hAnsi="Symbol" w:hint="default"/>
+      </w:rPr>
+    </w:lvl>
+  </w:abstractNum>
+  <w:abstractNum w:abstractNumId="3" w15:restartNumberingAfterBreak="0">
+    <w:nsid w:val="5C1A1E3F"/>
+    <w:multiLevelType w:val="singleLevel"/>
+    <w:tmpl w:val="04090001"/>
+    <w:lvl w:ilvl="0">
+      <w:start w:val="1"/>
+      <w:numFmt w:val="bullet"/>
+      <w:lvlText w:val=""/>
+      <w:lvlJc w:val="left"/>
+      <w:pPr>
+        <w:ind w:left="720" w:hanging="360"/>
+      </w:pPr>
+      <w:rPr>
+        <w:rFonts w:ascii="Symbol" w:hAnsi="Symbol" w:hint="default"/>
+      </w:rPr>
+    </w:lvl>
+  </w:abstractNum>
+  <w:abstractNum w:abstractNumId="4" w15:restartNumberingAfterBreak="0">
     <w:nsid w:val="5F72515E"/>
     <w:multiLevelType w:val="singleLevel"/>
     <w:tmpl w:val="04090001"/>
@@ -1738,7 +1664,7 @@
       </w:rPr>
     </w:lvl>
   </w:abstractNum>
-  <w:abstractNum w:abstractNumId="2" w15:restartNumberingAfterBreak="0">
+  <w:abstractNum w:abstractNumId="5" w15:restartNumberingAfterBreak="0">
     <w:nsid w:val="6CFF4201"/>
     <w:multiLevelType w:val="singleLevel"/>
     <w:tmpl w:val="04090001"/>
@@ -1756,13 +1682,22 @@
     </w:lvl>
   </w:abstractNum>
   <w:num w:numId="1" w16cid:durableId="1218056840">
+    <w:abstractNumId w:val="1"/>
+  </w:num>
+  <w:num w:numId="2" w16cid:durableId="76246876">
+    <w:abstractNumId w:val="4"/>
+  </w:num>
+  <w:num w:numId="3" w16cid:durableId="376394306">
+    <w:abstractNumId w:val="5"/>
+  </w:num>
+  <w:num w:numId="4" w16cid:durableId="1080444443">
+    <w:abstractNumId w:val="2"/>
+  </w:num>
+  <w:num w:numId="5" w16cid:durableId="1480876759">
     <w:abstractNumId w:val="0"/>
   </w:num>
-  <w:num w:numId="2" w16cid:durableId="76246876">
-    <w:abstractNumId w:val="1"/>
-  </w:num>
-  <w:num w:numId="3" w16cid:durableId="376394306">
-    <w:abstractNumId w:val="2"/>
+  <w:num w:numId="6" w16cid:durableId="1405103969">
+    <w:abstractNumId w:val="3"/>
   </w:num>
 </w:numbering>
 </file>

</xml_diff>

<commit_message>
Day1-Conversationalist: guard core chat call against failure, add project.md
GetChatMessageContentAsync was unguarded - a network blip, expired key,
or rate-limit response would crash the whole chat session and lose the
conversation. Wraps it in try/catch so a bad turn just continues the
loop. Syncs the docx's Complete Code listing and replaces missing.md
with project.md.
</commit_message>
<xml_diff>
--- a/Day1-Conversationalist.docx
+++ b/Day1-Conversationalist.docx
@@ -1093,48 +1093,254 @@
           <w:rFonts w:ascii="Consolas" w:hAnsi="Consolas"/>
           <w:sz w:val="19"/>
         </w:rPr>
-        <w:t xml:space="preserve">                chatHistory.AddUserMessage(userInput);</w:t>
-      </w:r>
-    </w:p>
-    <w:p>
-      <w:pPr>
-        <w:pStyle w:val="NoSpacing"/>
-        <w:rPr>
-          <w:rFonts w:ascii="Consolas" w:hAnsi="Consolas"/>
-          <w:sz w:val="19"/>
-        </w:rPr>
-      </w:pPr>
-    </w:p>
-    <w:p>
-      <w:pPr>
-        <w:pStyle w:val="NoSpacing"/>
-        <w:rPr>
-          <w:rFonts w:ascii="Consolas" w:hAnsi="Consolas"/>
-          <w:sz w:val="19"/>
-        </w:rPr>
-      </w:pPr>
-      <w:r>
-        <w:rPr>
-          <w:rFonts w:ascii="Consolas" w:hAnsi="Consolas"/>
-          <w:sz w:val="19"/>
-        </w:rPr>
-        <w:t xml:space="preserve">                // Ask the AI to generate a response based on the chat history and the latest user input</w:t>
-      </w:r>
-    </w:p>
-    <w:p>
-      <w:pPr>
-        <w:pStyle w:val="NoSpacing"/>
-        <w:rPr>
-          <w:rFonts w:ascii="Consolas" w:hAnsi="Consolas"/>
-          <w:sz w:val="19"/>
-        </w:rPr>
-      </w:pPr>
-      <w:r>
-        <w:rPr>
-          <w:rFonts w:ascii="Consolas" w:hAnsi="Consolas"/>
-          <w:sz w:val="19"/>
-        </w:rPr>
-        <w:t xml:space="preserve">                var response = await chatCompletionService.GetChatMessageContentAsync(chatHistory, kernel: kernel);</w:t>
+        <w:t xml:space="preserve">                </w:t>
+      </w:r>
+      <w:r>
+        <w:rPr>
+          <w:rFonts w:ascii="Consolas" w:hAnsi="Consolas"/>
+          <w:sz w:val="19"/>
+        </w:rPr>
+        <w:t>chatHistory.AddUserMessage(userInput);</w:t>
+      </w:r>
+    </w:p>
+    <w:p>
+      <w:pPr>
+        <w:pStyle w:val="NoSpacing"/>
+        <w:rPr>
+          <w:rFonts w:ascii="Consolas" w:hAnsi="Consolas"/>
+          <w:sz w:val="19"/>
+        </w:rPr>
+      </w:pPr>
+    </w:p>
+    <w:p>
+      <w:pPr>
+        <w:pStyle w:val="NoSpacing"/>
+        <w:rPr>
+          <w:rFonts w:ascii="Consolas" w:hAnsi="Consolas"/>
+          <w:sz w:val="19"/>
+        </w:rPr>
+      </w:pPr>
+      <w:r>
+        <w:rPr>
+          <w:rFonts w:ascii="Consolas" w:hAnsi="Consolas"/>
+          <w:sz w:val="19"/>
+        </w:rPr>
+        <w:t xml:space="preserve">                // Step 7: Ask</w:t>
+      </w:r>
+      <w:r>
+        <w:rPr>
+          <w:rFonts w:ascii="Consolas" w:hAnsi="Consolas"/>
+          <w:sz w:val="19"/>
+        </w:rPr>
+        <w:t xml:space="preserve"> the AI to generate a response based on the chat history and the latest user input.</w:t>
+      </w:r>
+    </w:p>
+    <w:p>
+      <w:pPr>
+        <w:pStyle w:val="NoSpacing"/>
+        <w:rPr>
+          <w:rFonts w:ascii="Consolas" w:hAnsi="Consolas"/>
+          <w:sz w:val="19"/>
+        </w:rPr>
+      </w:pPr>
+      <w:r>
+        <w:rPr>
+          <w:rFonts w:ascii="Consolas" w:hAnsi="Consolas"/>
+          <w:sz w:val="19"/>
+        </w:rPr>
+        <w:t xml:space="preserve">                // The call is wrapped in a try/catch because a network blip, an invalid/expired</w:t>
+      </w:r>
+    </w:p>
+    <w:p>
+      <w:pPr>
+        <w:pStyle w:val="NoSpacing"/>
+        <w:rPr>
+          <w:rFonts w:ascii="Consolas" w:hAnsi="Consolas"/>
+          <w:sz w:val="19"/>
+        </w:rPr>
+      </w:pPr>
+      <w:r>
+        <w:rPr>
+          <w:rFonts w:ascii="Consolas" w:hAnsi="Consolas"/>
+          <w:sz w:val="19"/>
+        </w:rPr>
+        <w:t xml:space="preserve">                // API key, or a rate-limit response would otherwise throw here and crash the</w:t>
+      </w:r>
+    </w:p>
+    <w:p>
+      <w:pPr>
+        <w:pStyle w:val="NoSpacing"/>
+        <w:rPr>
+          <w:rFonts w:ascii="Consolas" w:hAnsi="Consolas"/>
+          <w:sz w:val="19"/>
+        </w:rPr>
+      </w:pPr>
+      <w:r>
+        <w:rPr>
+          <w:rFonts w:ascii="Consolas" w:hAnsi="Consolas"/>
+          <w:sz w:val="19"/>
+        </w:rPr>
+        <w:t xml:space="preserve">                // whole chat session, losing the conversation instead of just this one turn.</w:t>
+      </w:r>
+    </w:p>
+    <w:p>
+      <w:pPr>
+        <w:pStyle w:val="NoSpacing"/>
+        <w:rPr>
+          <w:rFonts w:ascii="Consolas" w:hAnsi="Consolas"/>
+          <w:sz w:val="19"/>
+        </w:rPr>
+      </w:pPr>
+      <w:r>
+        <w:rPr>
+          <w:rFonts w:ascii="Consolas" w:hAnsi="Consolas"/>
+          <w:sz w:val="19"/>
+        </w:rPr>
+        <w:t xml:space="preserve">                ChatMessageContent response;</w:t>
+      </w:r>
+    </w:p>
+    <w:p>
+      <w:pPr>
+        <w:pStyle w:val="NoSpacing"/>
+        <w:rPr>
+          <w:rFonts w:ascii="Consolas" w:hAnsi="Consolas"/>
+          <w:sz w:val="19"/>
+        </w:rPr>
+      </w:pPr>
+      <w:r>
+        <w:rPr>
+          <w:rFonts w:ascii="Consolas" w:hAnsi="Consolas"/>
+          <w:sz w:val="19"/>
+        </w:rPr>
+        <w:t xml:space="preserve">                try</w:t>
+      </w:r>
+    </w:p>
+    <w:p>
+      <w:pPr>
+        <w:pStyle w:val="NoSpacing"/>
+        <w:rPr>
+          <w:rFonts w:ascii="Consolas" w:hAnsi="Consolas"/>
+          <w:sz w:val="19"/>
+        </w:rPr>
+      </w:pPr>
+      <w:r>
+        <w:rPr>
+          <w:rFonts w:ascii="Consolas" w:hAnsi="Consolas"/>
+          <w:sz w:val="19"/>
+        </w:rPr>
+        <w:t xml:space="preserve">                {</w:t>
+      </w:r>
+    </w:p>
+    <w:p>
+      <w:pPr>
+        <w:pStyle w:val="NoSpacing"/>
+        <w:rPr>
+          <w:rFonts w:ascii="Consolas" w:hAnsi="Consolas"/>
+          <w:sz w:val="19"/>
+        </w:rPr>
+      </w:pPr>
+      <w:r>
+        <w:rPr>
+          <w:rFonts w:ascii="Consolas" w:hAnsi="Consolas"/>
+          <w:sz w:val="19"/>
+        </w:rPr>
+        <w:t xml:space="preserve">                    response = await chatCompletionService.GetChatMessageContentAsync(chatHistory, kernel: kernel);</w:t>
+      </w:r>
+    </w:p>
+    <w:p>
+      <w:pPr>
+        <w:pStyle w:val="NoSpacing"/>
+        <w:rPr>
+          <w:rFonts w:ascii="Consolas" w:hAnsi="Consolas"/>
+          <w:sz w:val="19"/>
+        </w:rPr>
+      </w:pPr>
+      <w:r>
+        <w:rPr>
+          <w:rFonts w:ascii="Consolas" w:hAnsi="Consolas"/>
+          <w:sz w:val="19"/>
+        </w:rPr>
+        <w:t xml:space="preserve">                }</w:t>
+      </w:r>
+    </w:p>
+    <w:p>
+      <w:pPr>
+        <w:pStyle w:val="NoSpacing"/>
+        <w:rPr>
+          <w:rFonts w:ascii="Consolas" w:hAnsi="Consolas"/>
+          <w:sz w:val="19"/>
+        </w:rPr>
+      </w:pPr>
+      <w:r>
+        <w:rPr>
+          <w:rFonts w:ascii="Consolas" w:hAnsi="Consolas"/>
+          <w:sz w:val="19"/>
+        </w:rPr>
+        <w:t xml:space="preserve">                catch (Exception ex)</w:t>
+      </w:r>
+    </w:p>
+    <w:p>
+      <w:pPr>
+        <w:pStyle w:val="NoSpacing"/>
+        <w:rPr>
+          <w:rFonts w:ascii="Consolas" w:hAnsi="Consolas"/>
+          <w:sz w:val="19"/>
+        </w:rPr>
+      </w:pPr>
+      <w:r>
+        <w:rPr>
+          <w:rFonts w:ascii="Consolas" w:hAnsi="Consolas"/>
+          <w:sz w:val="19"/>
+        </w:rPr>
+        <w:t xml:space="preserve">                {</w:t>
+      </w:r>
+    </w:p>
+    <w:p>
+      <w:pPr>
+        <w:pStyle w:val="NoSpacing"/>
+        <w:rPr>
+          <w:rFonts w:ascii="Consolas" w:hAnsi="Consolas"/>
+          <w:sz w:val="19"/>
+        </w:rPr>
+      </w:pPr>
+      <w:r>
+        <w:rPr>
+          <w:rFonts w:ascii="Consolas" w:hAnsi="Consolas"/>
+          <w:sz w:val="19"/>
+        </w:rPr>
+        <w:t xml:space="preserve">                    Console.WriteLine($"Sorry, something went wrong talking to the AI: {ex.Message}");</w:t>
+      </w:r>
+    </w:p>
+    <w:p>
+      <w:pPr>
+        <w:pStyle w:val="NoSpacing"/>
+        <w:rPr>
+          <w:rFonts w:ascii="Consolas" w:hAnsi="Consolas"/>
+          <w:sz w:val="19"/>
+        </w:rPr>
+      </w:pPr>
+      <w:r>
+        <w:rPr>
+          <w:rFonts w:ascii="Consolas" w:hAnsi="Consolas"/>
+          <w:sz w:val="19"/>
+        </w:rPr>
+        <w:t xml:space="preserve">                    continue;</w:t>
+      </w:r>
+    </w:p>
+    <w:p>
+      <w:pPr>
+        <w:pStyle w:val="NoSpacing"/>
+        <w:rPr>
+          <w:rFonts w:ascii="Consolas" w:hAnsi="Consolas"/>
+          <w:sz w:val="19"/>
+        </w:rPr>
+      </w:pPr>
+      <w:r>
+        <w:rPr>
+          <w:rFonts w:ascii="Consolas" w:hAnsi="Consolas"/>
+          <w:sz w:val="19"/>
+        </w:rPr>
+        <w:t xml:space="preserve">                }</w:t>
       </w:r>
     </w:p>
     <w:p>
@@ -1328,6 +1534,7 @@
           <w:rFonts w:ascii="Consolas" w:hAnsi="Consolas"/>
           <w:sz w:val="19"/>
         </w:rPr>
+        <w:lastRenderedPageBreak/>
         <w:t xml:space="preserve">    }</w:t>
       </w:r>
     </w:p>
@@ -1364,11 +1571,7 @@
         <w:t>Steps 1 &amp; 2: The Builder and the Service.</w:t>
       </w:r>
       <w:r>
-        <w:t xml:space="preserve"> Semantic Kernel utilizes the standard .NET Builder pattern. We call `Kernel.CreateBuilder()` to start, then attach our "Engine" to it using `AddGoogleAIGeminiChatCompletion()`. The Kernel itself doesn't have a brain; it's a framework. By adding the Gemini Chat Completion service, along with the model ID </w:t>
-      </w:r>
-      <w:r>
-        <w:lastRenderedPageBreak/>
-        <w:t>(`gemini-2.5-flash-lite`) and the authentication key pulled from the `GEMINI_API_KEY` environment variable, we give the kernel a specific model to perform the thinking.</w:t>
+        <w:t xml:space="preserve"> Semantic Kernel utilizes the standard .NET Builder pattern. We call `Kernel.CreateBuilder()` to start, then attach our "Engine" to it using `AddGoogleAIGeminiChatCompletion()`. The Kernel itself doesn't have a brain; it's a framework. By adding the Gemini Chat Completion service, along with the model ID (`gemini-2.5-flash-lite`) and the authentication key pulled from the `GEMINI_API_KEY` environment variable, we give the kernel a specific model to perform the thinking.</w:t>
       </w:r>
     </w:p>
     <w:p/>

</xml_diff>